<commit_message>
Update CV to match portfolio: EY internship, LifeOS, Yankee Stores, AI-native positioning
</commit_message>
<xml_diff>
--- a/Abasiono_Mbat_CV.docx
+++ b/Abasiono_Mbat_CV.docx
@@ -15,6 +15,21 @@
           <w:sz w:val="36"/>
         </w:rPr>
         <w:t>ABASIONO JOSEPH MBAT</w:t>
+      </w:r>
+    </w:p>
+    <w:p>
+      <w:pPr>
+        <w:spacing w:after="40"/>
+        <w:jc w:val="center"/>
+      </w:pPr>
+      <w:r>
+        <w:rPr>
+          <w:rFonts w:ascii="Times New Roman" w:hAnsi="Times New Roman"/>
+          <w:b/>
+          <w:color w:val="000000"/>
+          <w:sz w:val="21"/>
+        </w:rPr>
+        <w:t>AI-Native Software Engineer</w:t>
       </w:r>
     </w:p>
     <w:p>
@@ -38,7 +53,7 @@
           <w:color w:val="000000"/>
           <w:sz w:val="19"/>
         </w:rPr>
-        <w:t xml:space="preserve"> | </w:t>
+        <w:t xml:space="preserve">  |  </w:t>
       </w:r>
       <w:r>
         <w:rPr>
@@ -56,7 +71,7 @@
           <w:color w:val="000000"/>
           <w:sz w:val="19"/>
         </w:rPr>
-        <w:t xml:space="preserve"> | </w:t>
+        <w:t xml:space="preserve">  |  </w:t>
       </w:r>
       <w:r>
         <w:rPr>
@@ -74,7 +89,7 @@
           <w:color w:val="000000"/>
           <w:sz w:val="19"/>
         </w:rPr>
-        <w:t xml:space="preserve"> | </w:t>
+        <w:t xml:space="preserve">  |  </w:t>
       </w:r>
       <w:r>
         <w:rPr>
@@ -92,7 +107,7 @@
           <w:color w:val="000000"/>
           <w:sz w:val="19"/>
         </w:rPr>
-        <w:t xml:space="preserve"> | </w:t>
+        <w:t xml:space="preserve">  |  </w:t>
       </w:r>
       <w:r>
         <w:rPr>
@@ -102,6 +117,42 @@
           <w:sz w:val="19"/>
         </w:rPr>
         <w:t>github.com/AJ-505</w:t>
+      </w:r>
+      <w:r>
+        <w:rPr>
+          <w:rFonts w:ascii="Times New Roman" w:hAnsi="Times New Roman"/>
+          <w:b w:val="0"/>
+          <w:color w:val="000000"/>
+          <w:sz w:val="19"/>
+        </w:rPr>
+        <w:t xml:space="preserve">  |  </w:t>
+      </w:r>
+      <w:r>
+        <w:rPr>
+          <w:rFonts w:ascii="Times New Roman" w:hAnsi="Times New Roman"/>
+          <w:b w:val="0"/>
+          <w:color w:val="000000"/>
+          <w:sz w:val="19"/>
+        </w:rPr>
+        <w:t>x.com/Abasiono_Mbat</w:t>
+      </w:r>
+      <w:r>
+        <w:rPr>
+          <w:rFonts w:ascii="Times New Roman" w:hAnsi="Times New Roman"/>
+          <w:b w:val="0"/>
+          <w:color w:val="000000"/>
+          <w:sz w:val="19"/>
+        </w:rPr>
+        <w:t xml:space="preserve">  |  </w:t>
+      </w:r>
+      <w:r>
+        <w:rPr>
+          <w:rFonts w:ascii="Times New Roman" w:hAnsi="Times New Roman"/>
+          <w:b w:val="0"/>
+          <w:color w:val="000000"/>
+          <w:sz w:val="19"/>
+        </w:rPr>
+        <w:t>abasiono-mbat-portfolio.vercel.app</w:t>
       </w:r>
     </w:p>
     <w:p>
@@ -126,7 +177,7 @@
         <w:tabs>
           <w:tab w:pos="9792" w:val="right"/>
         </w:tabs>
-        <w:spacing w:before="60" w:after="0"/>
+        <w:spacing w:before="120" w:after="0"/>
       </w:pPr>
       <w:r>
         <w:rPr>
@@ -195,7 +246,7 @@
     </w:p>
     <w:p>
       <w:pPr>
-        <w:spacing w:before="0" w:after="20"/>
+        <w:spacing w:before="0" w:after="40"/>
       </w:pPr>
       <w:r>
         <w:rPr>
@@ -229,7 +280,89 @@
         <w:tabs>
           <w:tab w:pos="9792" w:val="right"/>
         </w:tabs>
-        <w:spacing w:before="60" w:after="0"/>
+        <w:spacing w:before="120" w:after="0"/>
+      </w:pPr>
+      <w:r>
+        <w:rPr>
+          <w:rFonts w:ascii="Times New Roman" w:hAnsi="Times New Roman"/>
+          <w:b/>
+          <w:color w:val="000000"/>
+          <w:sz w:val="20"/>
+        </w:rPr>
+        <w:t>EY</w:t>
+      </w:r>
+      <w:r>
+        <w:tab/>
+      </w:r>
+      <w:r>
+        <w:rPr>
+          <w:rFonts w:ascii="Times New Roman" w:hAnsi="Times New Roman"/>
+          <w:b/>
+          <w:color w:val="000000"/>
+          <w:sz w:val="20"/>
+        </w:rPr>
+        <w:t>Lagos, Nigeria · Hybrid</w:t>
+      </w:r>
+    </w:p>
+    <w:p>
+      <w:pPr>
+        <w:tabs>
+          <w:tab w:pos="9792" w:val="right"/>
+        </w:tabs>
+        <w:spacing w:before="0" w:after="20"/>
+      </w:pPr>
+      <w:r>
+        <w:rPr>
+          <w:rFonts w:ascii="Times New Roman" w:hAnsi="Times New Roman"/>
+          <w:b w:val="0"/>
+          <w:color w:val="000000"/>
+          <w:sz w:val="20"/>
+        </w:rPr>
+        <w:t>Intern, Artificial Intelligence &amp; Back-End Web Development</w:t>
+      </w:r>
+      <w:r>
+        <w:tab/>
+      </w:r>
+      <w:r>
+        <w:rPr>
+          <w:rFonts w:ascii="Times New Roman" w:hAnsi="Times New Roman"/>
+          <w:b w:val="0"/>
+          <w:color w:val="000000"/>
+          <w:sz w:val="20"/>
+        </w:rPr>
+        <w:t>Jul – Aug 2026</w:t>
+      </w:r>
+    </w:p>
+    <w:p>
+      <w:pPr>
+        <w:spacing w:before="0" w:after="20"/>
+        <w:ind w:left="288" w:hanging="288"/>
+      </w:pPr>
+      <w:r>
+        <w:rPr>
+          <w:rFonts w:ascii="Times New Roman" w:hAnsi="Times New Roman"/>
+          <w:b w:val="0"/>
+          <w:color w:val="000000"/>
+          <w:sz w:val="20"/>
+        </w:rPr>
+        <w:t xml:space="preserve">• </w:t>
+      </w:r>
+      <w:r>
+        <w:rPr>
+          <w:rFonts w:ascii="Times New Roman" w:hAnsi="Times New Roman"/>
+          <w:b w:val="0"/>
+          <w:color w:val="000000"/>
+          <w:sz w:val="20"/>
+        </w:rPr>
+        <w:t>Developed a client system from prototype to production alongside the engineering team, working closely with data &amp; AI teams and QA to deliver high-quality internal and external software solutions</w:t>
+      </w:r>
+    </w:p>
+    <w:p>
+      <w:pPr>
+        <w:tabs>
+          <w:tab w:pos="9792" w:val="right"/>
+        </w:tabs>
+        <w:spacing w:before="120" w:after="0"/>
       </w:pPr>
       <w:r>
         <w:rPr>
@@ -303,7 +436,7 @@
           <w:color w:val="000000"/>
           <w:sz w:val="20"/>
         </w:rPr>
-        <w:t>Led full-stack product delivery for campus web initiatives, coordinating a team of student developers across concurrent builds using TypeScript, React, and Node.js</w:t>
+        <w:t>Built the AI Campus Chatbot with Microsoft Copilot Studio, answering student questions about school policies, staff, and lecturers, wired directly into the club website</w:t>
       </w:r>
     </w:p>
     <w:p>
@@ -327,65 +460,7 @@
           <w:color w:val="000000"/>
           <w:sz w:val="20"/>
         </w:rPr>
-        <w:t>Architected and deployed the Tech Innovation Club website, increasing student engagement by 40% within the first semester</w:t>
-      </w:r>
-    </w:p>
-    <w:p>
-      <w:pPr>
-        <w:tabs>
-          <w:tab w:pos="9792" w:val="right"/>
-        </w:tabs>
-        <w:spacing w:before="60" w:after="0"/>
-      </w:pPr>
-      <w:r>
-        <w:rPr>
-          <w:rFonts w:ascii="Times New Roman" w:hAnsi="Times New Roman"/>
-          <w:b/>
-          <w:color w:val="000000"/>
-          <w:sz w:val="20"/>
-        </w:rPr>
-        <w:t>Student and Community Platforms</w:t>
-      </w:r>
-      <w:r>
-        <w:tab/>
-      </w:r>
-      <w:r>
-        <w:rPr>
-          <w:rFonts w:ascii="Times New Roman" w:hAnsi="Times New Roman"/>
-          <w:b/>
-          <w:color w:val="000000"/>
-          <w:sz w:val="20"/>
-        </w:rPr>
-        <w:t>Lagos, Nigeria</w:t>
-      </w:r>
-    </w:p>
-    <w:p>
-      <w:pPr>
-        <w:tabs>
-          <w:tab w:pos="9792" w:val="right"/>
-        </w:tabs>
-        <w:spacing w:before="0" w:after="20"/>
-      </w:pPr>
-      <w:r>
-        <w:rPr>
-          <w:rFonts w:ascii="Times New Roman" w:hAnsi="Times New Roman"/>
-          <w:b w:val="0"/>
-          <w:color w:val="000000"/>
-          <w:sz w:val="20"/>
-        </w:rPr>
-        <w:t>Full-Stack Developer</w:t>
-      </w:r>
-      <w:r>
-        <w:tab/>
-      </w:r>
-      <w:r>
-        <w:rPr>
-          <w:rFonts w:ascii="Times New Roman" w:hAnsi="Times New Roman"/>
-          <w:b w:val="0"/>
-          <w:color w:val="000000"/>
-          <w:sz w:val="20"/>
-        </w:rPr>
-        <w:t>Oct 2025 – Present</w:t>
+        <w:t>Built the Computer-Based Test Platform (Next.js, Prisma, tRPC) with verified past questions, serving 300+ students preparing for JAMB; integrated with PAU Archive for university course discovery</w:t>
       </w:r>
     </w:p>
     <w:p>
@@ -409,7 +484,7 @@
           <w:color w:val="000000"/>
           <w:sz w:val="20"/>
         </w:rPr>
-        <w:t>Co-developed Pan-Atlantic University Archive, a student resource hub serving 800+ monthly active users, improving access to academic materials</w:t>
+        <w:t>Delivered the Codespark event website (Next.js, React, TypeScript): 100+ members, 3 sponsorships secured, 5+ startups emerged</w:t>
       </w:r>
     </w:p>
     <w:p>
@@ -433,7 +508,53 @@
           <w:color w:val="000000"/>
           <w:sz w:val="20"/>
         </w:rPr>
-        <w:t>Built Computer-Based Test Platform with verified past questions, onboarding 300+ active students within the first year</w:t>
+        <w:t>Grew the official club website to a 10.5% click-through rate through SEO optimization</w:t>
+      </w:r>
+    </w:p>
+    <w:p>
+      <w:pPr>
+        <w:spacing w:before="160" w:after="40"/>
+        <w:pBdr>
+          <w:bottom w:val="single" w:sz="4" w:space="1" w:color="000000"/>
+        </w:pBdr>
+      </w:pPr>
+      <w:r>
+        <w:rPr>
+          <w:rFonts w:ascii="Times New Roman" w:hAnsi="Times New Roman"/>
+          <w:b/>
+          <w:color w:val="000000"/>
+          <w:sz w:val="21"/>
+        </w:rPr>
+        <w:t>PROJECTS</w:t>
+      </w:r>
+    </w:p>
+    <w:p>
+      <w:pPr>
+        <w:tabs>
+          <w:tab w:pos="9792" w:val="right"/>
+        </w:tabs>
+        <w:spacing w:before="120" w:after="0"/>
+      </w:pPr>
+      <w:r>
+        <w:rPr>
+          <w:rFonts w:ascii="Times New Roman" w:hAnsi="Times New Roman"/>
+          <w:b/>
+          <w:color w:val="000000"/>
+          <w:sz w:val="20"/>
+        </w:rPr>
+        <w:t>PAU Archive</w:t>
+      </w:r>
+      <w:r>
+        <w:tab/>
+      </w:r>
+      <w:r>
+        <w:rPr>
+          <w:rFonts w:ascii="Times New Roman" w:hAnsi="Times New Roman"/>
+          <w:b/>
+          <w:color w:val="000000"/>
+          <w:sz w:val="20"/>
+        </w:rPr>
+        <w:t>pauarchive.com</w:t>
       </w:r>
     </w:p>
     <w:p>
@@ -457,7 +578,50 @@
           <w:color w:val="000000"/>
           <w:sz w:val="20"/>
         </w:rPr>
-        <w:t>Delivered Codespark and Tech Innovation Club event websites using Vite and TypeScript, supporting 3 sponsorships and increasing click-through rate by 10.5%</w:t>
+        <w:t>AI-powered study tutor for Pan-Atlantic University: 800+ monthly active students ask questions and get answers grounded in the university’s own course materials and past questions</w:t>
+      </w:r>
+    </w:p>
+    <w:p>
+      <w:pPr>
+        <w:spacing w:before="0" w:after="40"/>
+      </w:pPr>
+      <w:r>
+        <w:rPr>
+          <w:rFonts w:ascii="Times New Roman" w:hAnsi="Times New Roman"/>
+          <w:b w:val="0"/>
+          <w:color w:val="000000"/>
+          <w:sz w:val="19"/>
+        </w:rPr>
+        <w:t>Astro · TypeScript · PostgreSQL · AI</w:t>
+      </w:r>
+    </w:p>
+    <w:p>
+      <w:pPr>
+        <w:tabs>
+          <w:tab w:pos="9792" w:val="right"/>
+        </w:tabs>
+        <w:spacing w:before="120" w:after="0"/>
+      </w:pPr>
+      <w:r>
+        <w:rPr>
+          <w:rFonts w:ascii="Times New Roman" w:hAnsi="Times New Roman"/>
+          <w:b/>
+          <w:color w:val="000000"/>
+          <w:sz w:val="20"/>
+        </w:rPr>
+        <w:t>LifeOS</w:t>
+      </w:r>
+      <w:r>
+        <w:tab/>
+      </w:r>
+      <w:r>
+        <w:rPr>
+          <w:rFonts w:ascii="Times New Roman" w:hAnsi="Times New Roman"/>
+          <w:b/>
+          <w:color w:val="000000"/>
+          <w:sz w:val="20"/>
+        </w:rPr>
+        <w:t>lifeos-track.vercel.app</w:t>
       </w:r>
     </w:p>
     <w:p>
@@ -481,24 +645,21 @@
           <w:color w:val="000000"/>
           <w:sz w:val="20"/>
         </w:rPr>
-        <w:t>Created AI Campus Chatbot to streamline access to academic and policy information</w:t>
+        <w:t>Personal operating system: one place for projects, tasks, focus, timeline, and calendar sync, with Collaborative Spaces for live co-working</w:t>
       </w:r>
     </w:p>
     <w:p>
       <w:pPr>
-        <w:spacing w:before="160" w:after="40"/>
-        <w:pBdr>
-          <w:bottom w:val="single" w:sz="4" w:space="1" w:color="000000"/>
-        </w:pBdr>
+        <w:spacing w:before="0" w:after="40"/>
       </w:pPr>
       <w:r>
         <w:rPr>
           <w:rFonts w:ascii="Times New Roman" w:hAnsi="Times New Roman"/>
-          <w:b/>
+          <w:b w:val="0"/>
           <w:color w:val="000000"/>
-          <w:sz w:val="21"/>
+          <w:sz w:val="19"/>
         </w:rPr>
-        <w:t>LEADERSHIP EXPERIENCE</w:t>
+        <w:t>TanStack Start · React · Convex · Clerk · Google Calendar</w:t>
       </w:r>
     </w:p>
     <w:p>
@@ -506,7 +667,7 @@
         <w:tabs>
           <w:tab w:pos="9792" w:val="right"/>
         </w:tabs>
-        <w:spacing w:before="60" w:after="0"/>
+        <w:spacing w:before="120" w:after="0"/>
       </w:pPr>
       <w:r>
         <w:rPr>
@@ -515,7 +676,7 @@
           <w:color w:val="000000"/>
           <w:sz w:val="20"/>
         </w:rPr>
-        <w:t>Codespark Event Website</w:t>
+        <w:t>Yankee Stores</w:t>
       </w:r>
       <w:r>
         <w:tab/>
@@ -527,36 +688,7 @@
           <w:color w:val="000000"/>
           <w:sz w:val="20"/>
         </w:rPr>
-        <w:t>Lagos, Nigeria</w:t>
-      </w:r>
-    </w:p>
-    <w:p>
-      <w:pPr>
-        <w:tabs>
-          <w:tab w:pos="9792" w:val="right"/>
-        </w:tabs>
-        <w:spacing w:before="0" w:after="20"/>
-      </w:pPr>
-      <w:r>
-        <w:rPr>
-          <w:rFonts w:ascii="Times New Roman" w:hAnsi="Times New Roman"/>
-          <w:b w:val="0"/>
-          <w:color w:val="000000"/>
-          <w:sz w:val="20"/>
-        </w:rPr>
-        <w:t>Project Lead</w:t>
-      </w:r>
-      <w:r>
-        <w:tab/>
-      </w:r>
-      <w:r>
-        <w:rPr>
-          <w:rFonts w:ascii="Times New Roman" w:hAnsi="Times New Roman"/>
-          <w:b w:val="0"/>
-          <w:color w:val="000000"/>
-          <w:sz w:val="20"/>
-        </w:rPr>
-        <w:t>Feb 2025 – Apr 2025</w:t>
+        <w:t>yankeestores.com</w:t>
       </w:r>
     </w:p>
     <w:p>
@@ -580,7 +712,21 @@
           <w:color w:val="000000"/>
           <w:sz w:val="20"/>
         </w:rPr>
-        <w:t>Scoped and launched the event website in collaboration with a 5-person design and content team, delivering on a tight 8-week timeline</w:t>
+        <w:t>E-commerce for a raw honey &amp; beeswax business: full product catalogue, ordering flow, and an admin dashboard for the team to manage orders</w:t>
+      </w:r>
+    </w:p>
+    <w:p>
+      <w:pPr>
+        <w:spacing w:before="0" w:after="40"/>
+      </w:pPr>
+      <w:r>
+        <w:rPr>
+          <w:rFonts w:ascii="Times New Roman" w:hAnsi="Times New Roman"/>
+          <w:b w:val="0"/>
+          <w:color w:val="000000"/>
+          <w:sz w:val="19"/>
+        </w:rPr>
+        <w:t>TanStack Start · Drizzle ORM · libSQL · Resend</w:t>
       </w:r>
     </w:p>
     <w:p>
@@ -605,7 +751,7 @@
         <w:tabs>
           <w:tab w:pos="9792" w:val="right"/>
         </w:tabs>
-        <w:spacing w:before="60" w:after="0"/>
+        <w:spacing w:before="120" w:after="0"/>
       </w:pPr>
       <w:r>
         <w:rPr>
@@ -614,7 +760,7 @@
           <w:color w:val="000000"/>
           <w:sz w:val="20"/>
         </w:rPr>
-        <w:t>Living Green Club, Pan-Atlantic University</w:t>
+        <w:t>Codespark Event</w:t>
       </w:r>
       <w:r>
         <w:tab/>
@@ -626,94 +772,7 @@
           <w:color w:val="000000"/>
           <w:sz w:val="20"/>
         </w:rPr>
-        <w:t>Lagos, Nigeria</w:t>
-      </w:r>
-    </w:p>
-    <w:p>
-      <w:pPr>
-        <w:tabs>
-          <w:tab w:pos="9792" w:val="right"/>
-        </w:tabs>
-        <w:spacing w:before="0" w:after="20"/>
-      </w:pPr>
-      <w:r>
-        <w:rPr>
-          <w:rFonts w:ascii="Times New Roman" w:hAnsi="Times New Roman"/>
-          <w:b w:val="0"/>
-          <w:color w:val="000000"/>
-          <w:sz w:val="20"/>
-        </w:rPr>
-        <w:t>Volunteer Web Developer</w:t>
-      </w:r>
-      <w:r>
-        <w:tab/>
-      </w:r>
-      <w:r>
-        <w:rPr>
-          <w:rFonts w:ascii="Times New Roman" w:hAnsi="Times New Roman"/>
-          <w:b w:val="0"/>
-          <w:color w:val="000000"/>
-          <w:sz w:val="20"/>
-        </w:rPr>
-        <w:t>Apr 2025 – Jun 2025</w:t>
-      </w:r>
-    </w:p>
-    <w:p>
-      <w:pPr>
-        <w:tabs>
-          <w:tab w:pos="9792" w:val="right"/>
-        </w:tabs>
-        <w:spacing w:before="60" w:after="0"/>
-      </w:pPr>
-      <w:r>
-        <w:rPr>
-          <w:rFonts w:ascii="Times New Roman" w:hAnsi="Times New Roman"/>
-          <w:b/>
-          <w:color w:val="000000"/>
-          <w:sz w:val="20"/>
-        </w:rPr>
-        <w:t>Campus Tech Community, Pan-Atlantic University</w:t>
-      </w:r>
-      <w:r>
-        <w:tab/>
-      </w:r>
-      <w:r>
-        <w:rPr>
-          <w:rFonts w:ascii="Times New Roman" w:hAnsi="Times New Roman"/>
-          <w:b/>
-          <w:color w:val="000000"/>
-          <w:sz w:val="20"/>
-        </w:rPr>
-        <w:t>Lagos, Nigeria</w:t>
-      </w:r>
-    </w:p>
-    <w:p>
-      <w:pPr>
-        <w:tabs>
-          <w:tab w:pos="9792" w:val="right"/>
-        </w:tabs>
-        <w:spacing w:before="0" w:after="20"/>
-      </w:pPr>
-      <w:r>
-        <w:rPr>
-          <w:rFonts w:ascii="Times New Roman" w:hAnsi="Times New Roman"/>
-          <w:b w:val="0"/>
-          <w:color w:val="000000"/>
-          <w:sz w:val="20"/>
-        </w:rPr>
-        <w:t>Peer Mentor</w:t>
-      </w:r>
-      <w:r>
-        <w:tab/>
-      </w:r>
-      <w:r>
-        <w:rPr>
-          <w:rFonts w:ascii="Times New Roman" w:hAnsi="Times New Roman"/>
-          <w:b w:val="0"/>
-          <w:color w:val="000000"/>
-          <w:sz w:val="20"/>
-        </w:rPr>
-        <w:t>Oct 2025 – Present</w:t>
+        <w:t>Feb – Apr 2025</w:t>
       </w:r>
     </w:p>
     <w:p>
@@ -737,7 +796,113 @@
           <w:color w:val="000000"/>
           <w:sz w:val="20"/>
         </w:rPr>
-        <w:t>Mentored 15+ students on coding fundamentals, project reviews, and career guidance throughout the academic year</w:t>
+        <w:t>Organized the inaugural edition: 100+ members, 3 sponsorships secured, 5+ startups emerged</w:t>
+      </w:r>
+    </w:p>
+    <w:p>
+      <w:pPr>
+        <w:tabs>
+          <w:tab w:pos="9792" w:val="right"/>
+        </w:tabs>
+        <w:spacing w:before="120" w:after="0"/>
+      </w:pPr>
+      <w:r>
+        <w:rPr>
+          <w:rFonts w:ascii="Times New Roman" w:hAnsi="Times New Roman"/>
+          <w:b/>
+          <w:color w:val="000000"/>
+          <w:sz w:val="20"/>
+        </w:rPr>
+        <w:t>SST Makerspace Website</w:t>
+      </w:r>
+      <w:r>
+        <w:tab/>
+      </w:r>
+      <w:r>
+        <w:rPr>
+          <w:rFonts w:ascii="Times New Roman" w:hAnsi="Times New Roman"/>
+          <w:b/>
+          <w:color w:val="000000"/>
+          <w:sz w:val="20"/>
+        </w:rPr>
+        <w:t>2024</w:t>
+      </w:r>
+    </w:p>
+    <w:p>
+      <w:pPr>
+        <w:spacing w:before="0" w:after="20"/>
+        <w:ind w:left="288" w:hanging="288"/>
+      </w:pPr>
+      <w:r>
+        <w:rPr>
+          <w:rFonts w:ascii="Times New Roman" w:hAnsi="Times New Roman"/>
+          <w:b w:val="0"/>
+          <w:color w:val="000000"/>
+          <w:sz w:val="20"/>
+        </w:rPr>
+        <w:t xml:space="preserve">• </w:t>
+      </w:r>
+      <w:r>
+        <w:rPr>
+          <w:rFonts w:ascii="Times New Roman" w:hAnsi="Times New Roman"/>
+          <w:b w:val="0"/>
+          <w:color w:val="000000"/>
+          <w:sz w:val="20"/>
+        </w:rPr>
+        <w:t>Built the website for the student makerspace club (sst-makerspace.vercel.app)</w:t>
+      </w:r>
+    </w:p>
+    <w:p>
+      <w:pPr>
+        <w:tabs>
+          <w:tab w:pos="9792" w:val="right"/>
+        </w:tabs>
+        <w:spacing w:before="120" w:after="0"/>
+      </w:pPr>
+      <w:r>
+        <w:rPr>
+          <w:rFonts w:ascii="Times New Roman" w:hAnsi="Times New Roman"/>
+          <w:b/>
+          <w:color w:val="000000"/>
+          <w:sz w:val="20"/>
+        </w:rPr>
+        <w:t>Living Green Club Website</w:t>
+      </w:r>
+      <w:r>
+        <w:tab/>
+      </w:r>
+      <w:r>
+        <w:rPr>
+          <w:rFonts w:ascii="Times New Roman" w:hAnsi="Times New Roman"/>
+          <w:b/>
+          <w:color w:val="000000"/>
+          <w:sz w:val="20"/>
+        </w:rPr>
+        <w:t>2024</w:t>
+      </w:r>
+    </w:p>
+    <w:p>
+      <w:pPr>
+        <w:spacing w:before="0" w:after="20"/>
+        <w:ind w:left="288" w:hanging="288"/>
+      </w:pPr>
+      <w:r>
+        <w:rPr>
+          <w:rFonts w:ascii="Times New Roman" w:hAnsi="Times New Roman"/>
+          <w:b w:val="0"/>
+          <w:color w:val="000000"/>
+          <w:sz w:val="20"/>
+        </w:rPr>
+        <w:t xml:space="preserve">• </w:t>
+      </w:r>
+      <w:r>
+        <w:rPr>
+          <w:rFonts w:ascii="Times New Roman" w:hAnsi="Times New Roman"/>
+          <w:b w:val="0"/>
+          <w:color w:val="000000"/>
+          <w:sz w:val="20"/>
+        </w:rPr>
+        <w:t>Built the website for the environmental club (living-green-pau.netlify.app)</w:t>
       </w:r>
     </w:p>
     <w:p>
@@ -759,8 +924,17 @@
     </w:p>
     <w:p>
       <w:pPr>
-        <w:spacing w:before="40"/>
+        <w:spacing w:before="0" w:after="20"/>
       </w:pPr>
+      <w:r>
+        <w:rPr>
+          <w:rFonts w:ascii="Times New Roman" w:hAnsi="Times New Roman"/>
+          <w:b/>
+          <w:color w:val="000000"/>
+          <w:sz w:val="20"/>
+        </w:rPr>
+        <w:t xml:space="preserve">AI: </w:t>
+      </w:r>
       <w:r>
         <w:rPr>
           <w:rFonts w:ascii="Times New Roman" w:hAnsi="Times New Roman"/>
@@ -768,7 +942,115 @@
           <w:color w:val="000000"/>
           <w:sz w:val="20"/>
         </w:rPr>
-        <w:t>Languages: TypeScript, Go, SQL, Python  |  Frameworks: React, Next.js, Node.js, Express.js  |  Tools: PostgreSQL, Git, GitHub</w:t>
+        <w:t>Microsoft Copilot Studio, Prompt Engineering, NVIDIA Deep Learning</w:t>
+      </w:r>
+      <w:r>
+        <w:rPr>
+          <w:rFonts w:ascii="Times New Roman" w:hAnsi="Times New Roman"/>
+          <w:b w:val="0"/>
+          <w:color w:val="000000"/>
+          <w:sz w:val="19"/>
+        </w:rPr>
+        <w:t xml:space="preserve">  |  </w:t>
+      </w:r>
+      <w:r>
+        <w:rPr>
+          <w:rFonts w:ascii="Times New Roman" w:hAnsi="Times New Roman"/>
+          <w:b/>
+          <w:color w:val="000000"/>
+          <w:sz w:val="20"/>
+        </w:rPr>
+        <w:t xml:space="preserve">Languages: </w:t>
+      </w:r>
+      <w:r>
+        <w:rPr>
+          <w:rFonts w:ascii="Times New Roman" w:hAnsi="Times New Roman"/>
+          <w:b w:val="0"/>
+          <w:color w:val="000000"/>
+          <w:sz w:val="20"/>
+        </w:rPr>
+        <w:t>TypeScript, Go, SQL, Python</w:t>
+      </w:r>
+      <w:r>
+        <w:rPr>
+          <w:rFonts w:ascii="Times New Roman" w:hAnsi="Times New Roman"/>
+          <w:b w:val="0"/>
+          <w:color w:val="000000"/>
+          <w:sz w:val="19"/>
+        </w:rPr>
+        <w:t xml:space="preserve">  |  </w:t>
+      </w:r>
+      <w:r>
+        <w:rPr>
+          <w:rFonts w:ascii="Times New Roman" w:hAnsi="Times New Roman"/>
+          <w:b/>
+          <w:color w:val="000000"/>
+          <w:sz w:val="20"/>
+        </w:rPr>
+        <w:t xml:space="preserve">Frontend: </w:t>
+      </w:r>
+      <w:r>
+        <w:rPr>
+          <w:rFonts w:ascii="Times New Roman" w:hAnsi="Times New Roman"/>
+          <w:b w:val="0"/>
+          <w:color w:val="000000"/>
+          <w:sz w:val="20"/>
+        </w:rPr>
+        <w:t>React, Next.js, Tailwind CSS</w:t>
+      </w:r>
+      <w:r>
+        <w:rPr>
+          <w:rFonts w:ascii="Times New Roman" w:hAnsi="Times New Roman"/>
+          <w:b w:val="0"/>
+          <w:color w:val="000000"/>
+          <w:sz w:val="19"/>
+        </w:rPr>
+        <w:t xml:space="preserve">  |  </w:t>
+      </w:r>
+      <w:r>
+        <w:rPr>
+          <w:rFonts w:ascii="Times New Roman" w:hAnsi="Times New Roman"/>
+          <w:b/>
+          <w:color w:val="000000"/>
+          <w:sz w:val="20"/>
+        </w:rPr>
+        <w:t xml:space="preserve">Backend: </w:t>
+      </w:r>
+      <w:r>
+        <w:rPr>
+          <w:rFonts w:ascii="Times New Roman" w:hAnsi="Times New Roman"/>
+          <w:b w:val="0"/>
+          <w:color w:val="000000"/>
+          <w:sz w:val="20"/>
+        </w:rPr>
+        <w:t>Node.js, Express.js, PostgreSQL, Prisma, tRPC</w:t>
+      </w:r>
+      <w:r>
+        <w:rPr>
+          <w:rFonts w:ascii="Times New Roman" w:hAnsi="Times New Roman"/>
+          <w:b w:val="0"/>
+          <w:color w:val="000000"/>
+          <w:sz w:val="19"/>
+        </w:rPr>
+        <w:t xml:space="preserve">  |  </w:t>
+      </w:r>
+      <w:r>
+        <w:rPr>
+          <w:rFonts w:ascii="Times New Roman" w:hAnsi="Times New Roman"/>
+          <w:b/>
+          <w:color w:val="000000"/>
+          <w:sz w:val="20"/>
+        </w:rPr>
+        <w:t xml:space="preserve">Tools: </w:t>
+      </w:r>
+      <w:r>
+        <w:rPr>
+          <w:rFonts w:ascii="Times New Roman" w:hAnsi="Times New Roman"/>
+          <w:b w:val="0"/>
+          <w:color w:val="000000"/>
+          <w:sz w:val="20"/>
+        </w:rPr>
+        <w:t>Git, GitHub, Vercel</w:t>
       </w:r>
     </w:p>
     <w:sectPr>

</xml_diff>